<commit_message>
Fix Game System Plan
</commit_message>
<xml_diff>
--- a/기획/KoiAI_게임 시스템 기획 요약.docx
+++ b/기획/KoiAI_게임 시스템 기획 요약.docx
@@ -59,17 +59,7 @@
           <w:sz w:val="18"/>
           <w:lang w:eastAsia="ko-KR"/>
         </w:rPr>
-        <w:t xml:space="preserve">시스템 </w:t>
-      </w:r>
-      <w:proofErr w:type="gramStart"/>
-      <w:r>
-        <w:rPr>
-          <w:b/>
-          <w:color w:val="1E5F8C"/>
-          <w:sz w:val="18"/>
-          <w:lang w:eastAsia="ko-KR"/>
-        </w:rPr>
-        <w:t xml:space="preserve">구성 </w:t>
+        <w:t xml:space="preserve">시스템 구성 </w:t>
       </w:r>
       <w:r>
         <w:rPr>
@@ -88,84 +78,7 @@
           <w:shd w:val="clear" w:color="auto" w:fill="EAF3F8"/>
           <w:lang w:eastAsia="ko-KR"/>
         </w:rPr>
-        <w:t>스테이지형</w:t>
-      </w:r>
-      <w:proofErr w:type="gramEnd"/>
-      <w:r>
-        <w:rPr>
-          <w:rFonts w:hint="eastAsia"/>
-          <w:sz w:val="18"/>
-          <w:szCs w:val="18"/>
-          <w:shd w:val="clear" w:color="auto" w:fill="EAF3F8"/>
-          <w:lang w:eastAsia="ko-KR"/>
-        </w:rPr>
-        <w:t xml:space="preserve"> TPS / </w:t>
-      </w:r>
-      <w:proofErr w:type="spellStart"/>
-      <w:r>
-        <w:rPr>
-          <w:rFonts w:hint="eastAsia"/>
-          <w:sz w:val="18"/>
-          <w:szCs w:val="18"/>
-          <w:shd w:val="clear" w:color="auto" w:fill="EAF3F8"/>
-          <w:lang w:eastAsia="ko-KR"/>
-        </w:rPr>
-        <w:t>전투·성장</w:t>
-      </w:r>
-      <w:proofErr w:type="spellEnd"/>
-      <w:r>
-        <w:rPr>
-          <w:rFonts w:hint="eastAsia"/>
-          <w:sz w:val="18"/>
-          <w:szCs w:val="18"/>
-          <w:shd w:val="clear" w:color="auto" w:fill="EAF3F8"/>
-          <w:lang w:eastAsia="ko-KR"/>
-        </w:rPr>
-        <w:t xml:space="preserve"> 시스템 / 아이템 </w:t>
-      </w:r>
-      <w:proofErr w:type="spellStart"/>
-      <w:r>
-        <w:rPr>
-          <w:rFonts w:hint="eastAsia"/>
-          <w:sz w:val="18"/>
-          <w:szCs w:val="18"/>
-          <w:shd w:val="clear" w:color="auto" w:fill="EAF3F8"/>
-          <w:lang w:eastAsia="ko-KR"/>
-        </w:rPr>
-        <w:t>파밍·무기</w:t>
-      </w:r>
-      <w:proofErr w:type="spellEnd"/>
-      <w:r>
-        <w:rPr>
-          <w:rFonts w:hint="eastAsia"/>
-          <w:sz w:val="18"/>
-          <w:szCs w:val="18"/>
-          <w:shd w:val="clear" w:color="auto" w:fill="EAF3F8"/>
-          <w:lang w:eastAsia="ko-KR"/>
-        </w:rPr>
-        <w:t xml:space="preserve"> </w:t>
-      </w:r>
-      <w:proofErr w:type="spellStart"/>
-      <w:r>
-        <w:rPr>
-          <w:rFonts w:hint="eastAsia"/>
-          <w:sz w:val="18"/>
-          <w:szCs w:val="18"/>
-          <w:shd w:val="clear" w:color="auto" w:fill="EAF3F8"/>
-          <w:lang w:eastAsia="ko-KR"/>
-        </w:rPr>
-        <w:t>조합·속성</w:t>
-      </w:r>
-      <w:proofErr w:type="spellEnd"/>
-      <w:r>
-        <w:rPr>
-          <w:rFonts w:hint="eastAsia"/>
-          <w:sz w:val="18"/>
-          <w:szCs w:val="18"/>
-          <w:shd w:val="clear" w:color="auto" w:fill="EAF3F8"/>
-          <w:lang w:eastAsia="ko-KR"/>
-        </w:rPr>
-        <w:t xml:space="preserve"> 상성</w:t>
+        <w:t>스테이지형 TPS / 전투·성장 시스템 / 아이템 파밍·무기 조합·속성 상성</w:t>
       </w:r>
     </w:p>
     <w:tbl>
@@ -207,34 +120,14 @@
               <w:spacing w:after="0" w:line="240" w:lineRule="auto"/>
               <w:jc w:val="center"/>
             </w:pPr>
-            <w:proofErr w:type="spellStart"/>
             <w:r>
               <w:rPr>
                 <w:b/>
                 <w:color w:val="1E5F8C"/>
                 <w:sz w:val="18"/>
               </w:rPr>
-              <w:t>선택</w:t>
-            </w:r>
-            <w:proofErr w:type="spellEnd"/>
-            <w:r>
-              <w:rPr>
-                <w:b/>
-                <w:color w:val="1E5F8C"/>
-                <w:sz w:val="18"/>
-              </w:rPr>
-              <w:t xml:space="preserve"> </w:t>
-            </w:r>
-            <w:proofErr w:type="spellStart"/>
-            <w:r>
-              <w:rPr>
-                <w:b/>
-                <w:color w:val="1E5F8C"/>
-                <w:sz w:val="18"/>
-              </w:rPr>
-              <w:t>시스템</w:t>
-            </w:r>
-            <w:proofErr w:type="spellEnd"/>
+              <w:t>선택 시스템</w:t>
+            </w:r>
           </w:p>
         </w:tc>
         <w:tc>
@@ -253,14 +146,12 @@
             <w:pPr>
               <w:spacing w:after="0" w:line="240" w:lineRule="auto"/>
             </w:pPr>
-            <w:proofErr w:type="spellStart"/>
             <w:r>
               <w:rPr>
                 <w:sz w:val="18"/>
               </w:rPr>
               <w:t>전투·성장</w:t>
             </w:r>
-            <w:proofErr w:type="spellEnd"/>
           </w:p>
         </w:tc>
         <w:tc>
@@ -280,34 +171,14 @@
               <w:spacing w:after="0" w:line="240" w:lineRule="auto"/>
               <w:jc w:val="center"/>
             </w:pPr>
-            <w:proofErr w:type="spellStart"/>
             <w:r>
               <w:rPr>
                 <w:b/>
                 <w:color w:val="1E5F8C"/>
                 <w:sz w:val="18"/>
               </w:rPr>
-              <w:t>게임</w:t>
-            </w:r>
-            <w:proofErr w:type="spellEnd"/>
-            <w:r>
-              <w:rPr>
-                <w:b/>
-                <w:color w:val="1E5F8C"/>
-                <w:sz w:val="18"/>
-              </w:rPr>
-              <w:t xml:space="preserve"> </w:t>
-            </w:r>
-            <w:proofErr w:type="spellStart"/>
-            <w:r>
-              <w:rPr>
-                <w:b/>
-                <w:color w:val="1E5F8C"/>
-                <w:sz w:val="18"/>
-              </w:rPr>
-              <w:t>장르</w:t>
-            </w:r>
-            <w:proofErr w:type="spellEnd"/>
+              <w:t>게임 장르</w:t>
+            </w:r>
           </w:p>
         </w:tc>
         <w:tc>
@@ -326,19 +197,11 @@
             <w:pPr>
               <w:spacing w:after="0" w:line="240" w:lineRule="auto"/>
             </w:pPr>
-            <w:proofErr w:type="spellStart"/>
             <w:r>
               <w:rPr>
                 <w:sz w:val="18"/>
               </w:rPr>
-              <w:t>스테이지형</w:t>
-            </w:r>
-            <w:proofErr w:type="spellEnd"/>
-            <w:r>
-              <w:rPr>
-                <w:sz w:val="18"/>
-              </w:rPr>
-              <w:t xml:space="preserve"> TPS</w:t>
+              <w:t>스테이지형 TPS</w:t>
             </w:r>
           </w:p>
         </w:tc>
@@ -361,34 +224,14 @@
               <w:spacing w:after="0" w:line="252" w:lineRule="auto"/>
               <w:jc w:val="center"/>
             </w:pPr>
-            <w:proofErr w:type="spellStart"/>
             <w:r>
               <w:rPr>
                 <w:b/>
                 <w:color w:val="1E5F8C"/>
                 <w:sz w:val="18"/>
               </w:rPr>
-              <w:t>플레이</w:t>
-            </w:r>
-            <w:proofErr w:type="spellEnd"/>
-            <w:r>
-              <w:rPr>
-                <w:b/>
-                <w:color w:val="1E5F8C"/>
-                <w:sz w:val="18"/>
-              </w:rPr>
-              <w:t xml:space="preserve"> </w:t>
-            </w:r>
-            <w:proofErr w:type="spellStart"/>
-            <w:r>
-              <w:rPr>
-                <w:b/>
-                <w:color w:val="1E5F8C"/>
-                <w:sz w:val="18"/>
-              </w:rPr>
-              <w:t>목표</w:t>
-            </w:r>
-            <w:proofErr w:type="spellEnd"/>
+              <w:t>플레이 목표</w:t>
+            </w:r>
           </w:p>
         </w:tc>
         <w:tc>
@@ -410,16 +253,8 @@
               <w:rPr>
                 <w:sz w:val="18"/>
               </w:rPr>
-              <w:t xml:space="preserve">Roi </w:t>
-            </w:r>
-            <w:proofErr w:type="spellStart"/>
-            <w:r>
-              <w:rPr>
-                <w:sz w:val="18"/>
-              </w:rPr>
-              <w:t>구출</w:t>
-            </w:r>
-            <w:proofErr w:type="spellEnd"/>
+              <w:t>Roi 구출</w:t>
+            </w:r>
           </w:p>
         </w:tc>
         <w:tc>
@@ -439,34 +274,14 @@
               <w:spacing w:after="0" w:line="252" w:lineRule="auto"/>
               <w:jc w:val="center"/>
             </w:pPr>
-            <w:proofErr w:type="spellStart"/>
             <w:r>
               <w:rPr>
                 <w:b/>
                 <w:color w:val="1E5F8C"/>
                 <w:sz w:val="18"/>
               </w:rPr>
-              <w:t>최종</w:t>
-            </w:r>
-            <w:proofErr w:type="spellEnd"/>
-            <w:r>
-              <w:rPr>
-                <w:b/>
-                <w:color w:val="1E5F8C"/>
-                <w:sz w:val="18"/>
-              </w:rPr>
-              <w:t xml:space="preserve"> </w:t>
-            </w:r>
-            <w:proofErr w:type="spellStart"/>
-            <w:r>
-              <w:rPr>
-                <w:b/>
-                <w:color w:val="1E5F8C"/>
-                <w:sz w:val="18"/>
-              </w:rPr>
-              <w:t>목표</w:t>
-            </w:r>
-            <w:proofErr w:type="spellEnd"/>
+              <w:t>최종 목표</w:t>
+            </w:r>
           </w:p>
         </w:tc>
         <w:tc>
@@ -484,28 +299,12 @@
             <w:pPr>
               <w:spacing w:after="0" w:line="252" w:lineRule="auto"/>
             </w:pPr>
-            <w:proofErr w:type="spellStart"/>
             <w:r>
               <w:rPr>
                 <w:sz w:val="18"/>
               </w:rPr>
-              <w:t>보스</w:t>
-            </w:r>
-            <w:proofErr w:type="spellEnd"/>
-            <w:r>
-              <w:rPr>
-                <w:sz w:val="18"/>
-              </w:rPr>
-              <w:t xml:space="preserve"> </w:t>
-            </w:r>
-            <w:proofErr w:type="spellStart"/>
-            <w:r>
-              <w:rPr>
-                <w:sz w:val="18"/>
-              </w:rPr>
-              <w:t>처치</w:t>
-            </w:r>
-            <w:proofErr w:type="spellEnd"/>
+              <w:t>보스 처치</w:t>
+            </w:r>
           </w:p>
         </w:tc>
       </w:tr>
@@ -610,23 +409,7 @@
           <w:sz w:val="20"/>
           <w:lang w:eastAsia="ko-KR"/>
         </w:rPr>
-        <w:t xml:space="preserve"> </w:t>
-      </w:r>
-      <w:proofErr w:type="spellStart"/>
-      <w:r>
-        <w:rPr>
-          <w:sz w:val="20"/>
-          <w:lang w:eastAsia="ko-KR"/>
-        </w:rPr>
-        <w:t>파밍</w:t>
-      </w:r>
-      <w:proofErr w:type="spellEnd"/>
-      <w:r>
-        <w:rPr>
-          <w:sz w:val="20"/>
-          <w:lang w:eastAsia="ko-KR"/>
-        </w:rPr>
-        <w:t>·조합·상성 시스템을 연결</w:t>
+        <w:t xml:space="preserve"> 파밍·조합·상성 시스템을 연결</w:t>
       </w:r>
     </w:p>
     <w:p>
@@ -637,28 +420,12 @@
           <w:numId w:val="1"/>
         </w:numPr>
       </w:pPr>
-      <w:proofErr w:type="spellStart"/>
       <w:r>
         <w:rPr>
           <w:rFonts w:ascii="맑은 고딕" w:eastAsia="맑은 고딕" w:hAnsi="맑은 고딕"/>
         </w:rPr>
-        <w:t>시스템</w:t>
+        <w:t>시스템 목적</w:t>
       </w:r>
-      <w:proofErr w:type="spellEnd"/>
-      <w:r>
-        <w:rPr>
-          <w:rFonts w:ascii="맑은 고딕" w:eastAsia="맑은 고딕" w:hAnsi="맑은 고딕"/>
-        </w:rPr>
-        <w:t xml:space="preserve"> </w:t>
-      </w:r>
-      <w:proofErr w:type="spellStart"/>
-      <w:r>
-        <w:rPr>
-          <w:rFonts w:ascii="맑은 고딕" w:eastAsia="맑은 고딕" w:hAnsi="맑은 고딕"/>
-        </w:rPr>
-        <w:t>목적</w:t>
-      </w:r>
-      <w:proofErr w:type="spellEnd"/>
     </w:p>
     <w:p>
       <w:pPr>
@@ -679,48 +446,14 @@
           <w:sz w:val="18"/>
           <w:lang w:eastAsia="ko-KR"/>
         </w:rPr>
-        <w:t xml:space="preserve">목표 </w:t>
-      </w:r>
-      <w:proofErr w:type="gramStart"/>
-      <w:r>
-        <w:rPr>
-          <w:b/>
-          <w:color w:val="1E5F8C"/>
-          <w:sz w:val="18"/>
-          <w:lang w:eastAsia="ko-KR"/>
-        </w:rPr>
-        <w:t xml:space="preserve">구조  </w:t>
+        <w:t xml:space="preserve">목표 구조  </w:t>
       </w:r>
       <w:r>
         <w:rPr>
           <w:sz w:val="18"/>
           <w:lang w:eastAsia="ko-KR"/>
         </w:rPr>
-        <w:t>단기</w:t>
-      </w:r>
-      <w:proofErr w:type="gramEnd"/>
-      <w:r>
-        <w:rPr>
-          <w:sz w:val="18"/>
-          <w:lang w:eastAsia="ko-KR"/>
-        </w:rPr>
-        <w:t xml:space="preserve"> 목표: 전투·</w:t>
-      </w:r>
-      <w:proofErr w:type="spellStart"/>
-      <w:r>
-        <w:rPr>
-          <w:sz w:val="18"/>
-          <w:lang w:eastAsia="ko-KR"/>
-        </w:rPr>
-        <w:t>파밍</w:t>
-      </w:r>
-      <w:proofErr w:type="spellEnd"/>
-      <w:r>
-        <w:rPr>
-          <w:sz w:val="18"/>
-          <w:lang w:eastAsia="ko-KR"/>
-        </w:rPr>
-        <w:t>·강화 / 장기 목표: Roi 구출·보스 처치</w:t>
+        <w:t>단기 목표: 전투·파밍·강화 / 장기 목표: Roi 구출·보스 처치</w:t>
       </w:r>
     </w:p>
     <w:p>
@@ -807,32 +540,14 @@
           <w:sz w:val="18"/>
           <w:lang w:eastAsia="ko-KR"/>
         </w:rPr>
-        <w:t xml:space="preserve">핵심 </w:t>
-      </w:r>
-      <w:proofErr w:type="gramStart"/>
-      <w:r>
-        <w:rPr>
-          <w:b/>
-          <w:color w:val="1E5F8C"/>
-          <w:sz w:val="18"/>
-          <w:lang w:eastAsia="ko-KR"/>
-        </w:rPr>
-        <w:t xml:space="preserve">루프  </w:t>
+        <w:t xml:space="preserve">핵심 루프  </w:t>
       </w:r>
       <w:r>
         <w:rPr>
           <w:sz w:val="18"/>
           <w:lang w:eastAsia="ko-KR"/>
         </w:rPr>
-        <w:t>전투</w:t>
-      </w:r>
-      <w:proofErr w:type="gramEnd"/>
-      <w:r>
-        <w:rPr>
-          <w:sz w:val="18"/>
-          <w:lang w:eastAsia="ko-KR"/>
-        </w:rPr>
-        <w:t>: 이동 -&gt; 탐색 -&gt; 조준 -&gt; 공격 -&gt; 회피 / 성장: 획득 -&gt; 조합 -&gt; 능력 선택</w:t>
+        <w:t>전투: 이동 -&gt; 탐색 -&gt; 조준 -&gt; 공격 -&gt; 회피 / 성장: 획득 -&gt; 조합 -&gt; 능력 선택</w:t>
       </w:r>
     </w:p>
     <w:p>
@@ -858,23 +573,7 @@
           <w:sz w:val="20"/>
           <w:lang w:eastAsia="ko-KR"/>
         </w:rPr>
-        <w:t xml:space="preserve">TPS 전투, 아이템 </w:t>
-      </w:r>
-      <w:proofErr w:type="spellStart"/>
-      <w:r>
-        <w:rPr>
-          <w:sz w:val="20"/>
-          <w:lang w:eastAsia="ko-KR"/>
-        </w:rPr>
-        <w:t>파밍</w:t>
-      </w:r>
-      <w:proofErr w:type="spellEnd"/>
-      <w:r>
-        <w:rPr>
-          <w:sz w:val="20"/>
-          <w:lang w:eastAsia="ko-KR"/>
-        </w:rPr>
-        <w:t>, 무기·자원 조합, 공유 특성 성장, 잠입·발각</w:t>
+        <w:t>TPS 전투, 아이템 파밍, 무기·자원 조합, 공유 특성 성장, 잠입·발각</w:t>
       </w:r>
     </w:p>
     <w:p>
@@ -949,48 +648,14 @@
           <w:sz w:val="18"/>
           <w:lang w:eastAsia="ko-KR"/>
         </w:rPr>
-        <w:t xml:space="preserve">진행 </w:t>
-      </w:r>
-      <w:proofErr w:type="gramStart"/>
-      <w:r>
-        <w:rPr>
-          <w:b/>
-          <w:color w:val="1E5F8C"/>
-          <w:sz w:val="18"/>
-          <w:lang w:eastAsia="ko-KR"/>
-        </w:rPr>
-        <w:t xml:space="preserve">흐름  </w:t>
+        <w:t xml:space="preserve">진행 흐름  </w:t>
       </w:r>
       <w:r>
         <w:rPr>
           <w:sz w:val="18"/>
           <w:lang w:eastAsia="ko-KR"/>
         </w:rPr>
-        <w:t>도입</w:t>
-      </w:r>
-      <w:proofErr w:type="gramEnd"/>
-      <w:r>
-        <w:rPr>
-          <w:sz w:val="18"/>
-          <w:lang w:eastAsia="ko-KR"/>
-        </w:rPr>
-        <w:t xml:space="preserve"> 스토리 -&gt; 스테이지 -&gt; 미션·</w:t>
-      </w:r>
-      <w:proofErr w:type="spellStart"/>
-      <w:r>
-        <w:rPr>
-          <w:sz w:val="18"/>
-          <w:lang w:eastAsia="ko-KR"/>
-        </w:rPr>
-        <w:t>파밍</w:t>
-      </w:r>
-      <w:proofErr w:type="spellEnd"/>
-      <w:r>
-        <w:rPr>
-          <w:sz w:val="18"/>
-          <w:lang w:eastAsia="ko-KR"/>
-        </w:rPr>
-        <w:t>·전투 -&gt; 강화·능력 선택 -&gt; 다음 스테이지</w:t>
+        <w:t>도입 스토리 -&gt; 스테이지 -&gt; 미션·파밍·전투 -&gt; 강화·능력 선택 -&gt; 다음 스테이지</w:t>
       </w:r>
     </w:p>
     <w:p>
@@ -1042,30 +707,14 @@
           <w:sz w:val="20"/>
           <w:lang w:eastAsia="ko-KR"/>
         </w:rPr>
-        <w:t xml:space="preserve">Koi 또는 Roi </w:t>
-      </w:r>
-      <w:proofErr w:type="gramStart"/>
-      <w:r>
-        <w:rPr>
-          <w:sz w:val="20"/>
-          <w:lang w:eastAsia="ko-KR"/>
-        </w:rPr>
-        <w:t>사망</w:t>
+        <w:t>Koi 또는 Roi 사망</w:t>
       </w:r>
       <w:r>
         <w:rPr>
           <w:sz w:val="20"/>
           <w:lang w:eastAsia="ko-KR"/>
         </w:rPr>
-        <w:t xml:space="preserve"> /</w:t>
-      </w:r>
-      <w:proofErr w:type="gramEnd"/>
-      <w:r>
-        <w:rPr>
-          <w:sz w:val="20"/>
-          <w:lang w:eastAsia="ko-KR"/>
-        </w:rPr>
-        <w:t xml:space="preserve"> </w:t>
+        <w:t xml:space="preserve"> / </w:t>
       </w:r>
       <w:r>
         <w:rPr>
@@ -1104,23 +753,7 @@
           <w:sz w:val="20"/>
           <w:lang w:eastAsia="ko-KR"/>
         </w:rPr>
-        <w:t xml:space="preserve">세 장의 </w:t>
-      </w:r>
-      <w:proofErr w:type="spellStart"/>
-      <w:r>
-        <w:rPr>
-          <w:sz w:val="20"/>
-          <w:lang w:eastAsia="ko-KR"/>
-        </w:rPr>
-        <w:t>패널티</w:t>
-      </w:r>
-      <w:proofErr w:type="spellEnd"/>
-      <w:r>
-        <w:rPr>
-          <w:sz w:val="20"/>
-          <w:lang w:eastAsia="ko-KR"/>
-        </w:rPr>
-        <w:t xml:space="preserve"> 카드 중 하나를 선택한 뒤 나머지 데이터를 유지하고 해당 스테이지 재시작</w:t>
+        <w:t>세 장의 패널티 카드 중 하나를 선택한 뒤 나머지 데이터를 유지하고 해당 스테이지 재시작</w:t>
       </w:r>
     </w:p>
     <w:tbl>
@@ -1242,14 +875,12 @@
               <w:spacing w:after="0" w:line="252" w:lineRule="auto"/>
               <w:jc w:val="center"/>
             </w:pPr>
-            <w:proofErr w:type="spellStart"/>
             <w:r>
               <w:rPr>
                 <w:sz w:val="18"/>
               </w:rPr>
               <w:t>성공</w:t>
             </w:r>
-            <w:proofErr w:type="spellEnd"/>
           </w:p>
         </w:tc>
         <w:tc>
@@ -1321,14 +952,12 @@
               <w:spacing w:after="0" w:line="252" w:lineRule="auto"/>
               <w:jc w:val="center"/>
             </w:pPr>
-            <w:proofErr w:type="spellStart"/>
             <w:r>
               <w:rPr>
                 <w:sz w:val="18"/>
               </w:rPr>
               <w:t>실패</w:t>
             </w:r>
-            <w:proofErr w:type="spellEnd"/>
           </w:p>
         </w:tc>
         <w:tc>
@@ -1350,7 +979,6 @@
                 <w:lang w:eastAsia="ko-KR"/>
               </w:rPr>
             </w:pPr>
-            <w:proofErr w:type="gramStart"/>
             <w:r>
               <w:rPr>
                 <w:sz w:val="18"/>
@@ -1358,7 +986,6 @@
               </w:rPr>
               <w:t>사망 /</w:t>
             </w:r>
-            <w:proofErr w:type="gramEnd"/>
             <w:r>
               <w:rPr>
                 <w:sz w:val="18"/>
@@ -1402,21 +1029,12 @@
                 <w:lang w:eastAsia="ko-KR"/>
               </w:rPr>
             </w:pPr>
-            <w:proofErr w:type="spellStart"/>
             <w:r>
               <w:rPr>
                 <w:sz w:val="18"/>
                 <w:lang w:eastAsia="ko-KR"/>
               </w:rPr>
-              <w:t>패널티</w:t>
-            </w:r>
-            <w:proofErr w:type="spellEnd"/>
-            <w:r>
-              <w:rPr>
-                <w:sz w:val="18"/>
-                <w:lang w:eastAsia="ko-KR"/>
-              </w:rPr>
-              <w:t xml:space="preserve"> 카드 1장 선택 후 재도전</w:t>
+              <w:t>패널티 카드 1장 선택 후 재도전</w:t>
             </w:r>
           </w:p>
         </w:tc>
@@ -1475,57 +1093,13 @@
           <w:numId w:val="1"/>
         </w:numPr>
       </w:pPr>
-      <w:proofErr w:type="spellStart"/>
       <w:r>
         <w:rPr>
           <w:rFonts w:ascii="맑은 고딕" w:eastAsia="맑은 고딕" w:hAnsi="맑은 고딕"/>
         </w:rPr>
         <w:lastRenderedPageBreak/>
-        <w:t>사용</w:t>
+        <w:t>사용 공식과 예시 계산</w:t>
       </w:r>
-      <w:proofErr w:type="spellEnd"/>
-      <w:r>
-        <w:rPr>
-          <w:rFonts w:ascii="맑은 고딕" w:eastAsia="맑은 고딕" w:hAnsi="맑은 고딕"/>
-        </w:rPr>
-        <w:t xml:space="preserve"> </w:t>
-      </w:r>
-      <w:proofErr w:type="spellStart"/>
-      <w:r>
-        <w:rPr>
-          <w:rFonts w:ascii="맑은 고딕" w:eastAsia="맑은 고딕" w:hAnsi="맑은 고딕"/>
-        </w:rPr>
-        <w:t>공식과</w:t>
-      </w:r>
-      <w:proofErr w:type="spellEnd"/>
-      <w:r>
-        <w:rPr>
-          <w:rFonts w:ascii="맑은 고딕" w:eastAsia="맑은 고딕" w:hAnsi="맑은 고딕"/>
-        </w:rPr>
-        <w:t xml:space="preserve"> </w:t>
-      </w:r>
-      <w:proofErr w:type="spellStart"/>
-      <w:r>
-        <w:rPr>
-          <w:rFonts w:ascii="맑은 고딕" w:eastAsia="맑은 고딕" w:hAnsi="맑은 고딕"/>
-        </w:rPr>
-        <w:t>예시</w:t>
-      </w:r>
-      <w:proofErr w:type="spellEnd"/>
-      <w:r>
-        <w:rPr>
-          <w:rFonts w:ascii="맑은 고딕" w:eastAsia="맑은 고딕" w:hAnsi="맑은 고딕"/>
-        </w:rPr>
-        <w:t xml:space="preserve"> </w:t>
-      </w:r>
-      <w:proofErr w:type="spellStart"/>
-      <w:r>
-        <w:rPr>
-          <w:rFonts w:ascii="맑은 고딕" w:eastAsia="맑은 고딕" w:hAnsi="맑은 고딕"/>
-        </w:rPr>
-        <w:t>계산</w:t>
-      </w:r>
-      <w:proofErr w:type="spellEnd"/>
     </w:p>
     <w:p>
       <w:pPr>
@@ -1546,32 +1120,14 @@
           <w:sz w:val="18"/>
           <w:lang w:eastAsia="ko-KR"/>
         </w:rPr>
-        <w:t xml:space="preserve">계산 </w:t>
-      </w:r>
-      <w:proofErr w:type="gramStart"/>
-      <w:r>
-        <w:rPr>
-          <w:b/>
-          <w:color w:val="1E5F8C"/>
-          <w:sz w:val="18"/>
-          <w:lang w:eastAsia="ko-KR"/>
-        </w:rPr>
-        <w:t xml:space="preserve">요소  </w:t>
+        <w:t xml:space="preserve">계산 요소  </w:t>
       </w:r>
       <w:r>
         <w:rPr>
           <w:sz w:val="18"/>
           <w:lang w:eastAsia="ko-KR"/>
         </w:rPr>
-        <w:t>무기</w:t>
-      </w:r>
-      <w:proofErr w:type="gramEnd"/>
-      <w:r>
-        <w:rPr>
-          <w:sz w:val="18"/>
-          <w:lang w:eastAsia="ko-KR"/>
-        </w:rPr>
-        <w:t xml:space="preserve"> 레벨 성장 / 속성·부위·공격력·방어력을 반영한 최종 피해 / 강화 및 조합 비용</w:t>
+        <w:t>무기 레벨 성장 / 속성·부위·공격력·방어력을 반영한 최종 피해 / 강화 및 조합 비용</w:t>
       </w:r>
     </w:p>
     <w:p>
@@ -1680,23 +1236,7 @@
                 <w:b/>
                 <w:sz w:val="17"/>
               </w:rPr>
-              <w:t xml:space="preserve">적 </w:t>
-            </w:r>
-            <w:proofErr w:type="spellStart"/>
-            <w:r>
-              <w:rPr>
-                <w:b/>
-                <w:sz w:val="17"/>
-              </w:rPr>
-              <w:t>방어</w:t>
-            </w:r>
-            <w:proofErr w:type="spellEnd"/>
-            <w:r>
-              <w:rPr>
-                <w:b/>
-                <w:sz w:val="17"/>
-              </w:rPr>
-              <w:t>→</w:t>
+              <w:t>적 방어→</w:t>
             </w:r>
           </w:p>
           <w:p>
@@ -1704,7 +1244,6 @@
               <w:spacing w:after="0" w:line="240" w:lineRule="auto"/>
               <w:jc w:val="center"/>
             </w:pPr>
-            <w:proofErr w:type="spellStart"/>
             <w:r>
               <w:rPr>
                 <w:rFonts w:hint="eastAsia"/>
@@ -1713,29 +1252,12 @@
               </w:rPr>
               <w:t>무기</w:t>
             </w:r>
-            <w:proofErr w:type="spellEnd"/>
             <w:r>
               <w:rPr>
                 <w:b/>
                 <w:sz w:val="17"/>
               </w:rPr>
-              <w:t xml:space="preserve"> </w:t>
-            </w:r>
-            <w:proofErr w:type="spellStart"/>
-            <w:r>
-              <w:rPr>
-                <w:b/>
-                <w:sz w:val="17"/>
-              </w:rPr>
-              <w:t>공격</w:t>
-            </w:r>
-            <w:proofErr w:type="spellEnd"/>
-            <w:r>
-              <w:rPr>
-                <w:b/>
-                <w:sz w:val="17"/>
-              </w:rPr>
-              <w:t>↓</w:t>
+              <w:t xml:space="preserve"> 공격↓</w:t>
             </w:r>
           </w:p>
         </w:tc>
@@ -2951,7 +2473,6 @@
               <w:spacing w:after="0" w:line="252" w:lineRule="auto"/>
               <w:jc w:val="center"/>
             </w:pPr>
-            <w:proofErr w:type="spellStart"/>
             <w:r>
               <w:rPr>
                 <w:b/>
@@ -2959,7 +2480,6 @@
               </w:rPr>
               <w:t>항목</w:t>
             </w:r>
-            <w:proofErr w:type="spellEnd"/>
           </w:p>
         </w:tc>
         <w:tc>
@@ -3031,28 +2551,12 @@
               <w:spacing w:after="0" w:line="252" w:lineRule="auto"/>
               <w:jc w:val="center"/>
             </w:pPr>
-            <w:proofErr w:type="spellStart"/>
             <w:r>
               <w:rPr>
                 <w:sz w:val="17"/>
               </w:rPr>
-              <w:t>무기</w:t>
-            </w:r>
-            <w:proofErr w:type="spellEnd"/>
-            <w:r>
-              <w:rPr>
-                <w:sz w:val="17"/>
-              </w:rPr>
-              <w:t xml:space="preserve"> </w:t>
-            </w:r>
-            <w:proofErr w:type="spellStart"/>
-            <w:r>
-              <w:rPr>
-                <w:sz w:val="17"/>
-              </w:rPr>
-              <w:t>데미지</w:t>
-            </w:r>
-            <w:proofErr w:type="spellEnd"/>
+              <w:t>무기 데미지</w:t>
+            </w:r>
           </w:p>
         </w:tc>
         <w:tc>
@@ -3074,7 +2578,21 @@
               <w:rPr>
                 <w:sz w:val="17"/>
               </w:rPr>
-              <w:t>기본 데미지 * (1 + 레벨 / 20)</w:t>
+              <w:t xml:space="preserve">기본 데미지 * (1 + </w:t>
+            </w:r>
+            <w:r>
+              <w:rPr>
+                <w:rFonts w:hint="eastAsia"/>
+                <w:sz w:val="17"/>
+                <w:lang w:eastAsia="ko-KR"/>
+              </w:rPr>
+              <w:t xml:space="preserve">무기 </w:t>
+            </w:r>
+            <w:r>
+              <w:rPr>
+                <w:sz w:val="17"/>
+              </w:rPr>
+              <w:t>레벨 / 20)</w:t>
             </w:r>
           </w:p>
         </w:tc>
@@ -3315,28 +2833,12 @@
               <w:spacing w:after="0" w:line="252" w:lineRule="auto"/>
               <w:jc w:val="center"/>
             </w:pPr>
-            <w:proofErr w:type="spellStart"/>
             <w:r>
               <w:rPr>
                 <w:sz w:val="17"/>
               </w:rPr>
-              <w:t>최종</w:t>
-            </w:r>
-            <w:proofErr w:type="spellEnd"/>
-            <w:r>
-              <w:rPr>
-                <w:sz w:val="17"/>
-              </w:rPr>
-              <w:t xml:space="preserve"> </w:t>
-            </w:r>
-            <w:proofErr w:type="spellStart"/>
-            <w:r>
-              <w:rPr>
-                <w:sz w:val="17"/>
-              </w:rPr>
-              <w:t>피해</w:t>
-            </w:r>
-            <w:proofErr w:type="spellEnd"/>
+              <w:t>최종 피해</w:t>
+            </w:r>
           </w:p>
         </w:tc>
         <w:tc>
@@ -3363,7 +2865,65 @@
                 <w:sz w:val="17"/>
                 <w:lang w:eastAsia="ko-KR"/>
               </w:rPr>
-              <w:t>기본 피해 * 상성 * 부위 * ((100+공격)/(100+방어))</w:t>
+              <w:t>기본 피해 * 상성</w:t>
+            </w:r>
+            <w:r>
+              <w:rPr>
+                <w:rFonts w:hint="eastAsia"/>
+                <w:sz w:val="17"/>
+                <w:lang w:eastAsia="ko-KR"/>
+              </w:rPr>
+              <w:t xml:space="preserve"> 배율</w:t>
+            </w:r>
+            <w:r>
+              <w:rPr>
+                <w:sz w:val="17"/>
+                <w:lang w:eastAsia="ko-KR"/>
+              </w:rPr>
+              <w:t xml:space="preserve"> * 부위</w:t>
+            </w:r>
+            <w:r>
+              <w:rPr>
+                <w:rFonts w:hint="eastAsia"/>
+                <w:sz w:val="17"/>
+                <w:lang w:eastAsia="ko-KR"/>
+              </w:rPr>
+              <w:t xml:space="preserve"> 배율</w:t>
+            </w:r>
+            <w:r>
+              <w:rPr>
+                <w:sz w:val="17"/>
+                <w:lang w:eastAsia="ko-KR"/>
+              </w:rPr>
+              <w:t xml:space="preserve"> * ((100+공격)</w:t>
+            </w:r>
+            <w:r>
+              <w:rPr>
+                <w:sz w:val="17"/>
+                <w:lang w:eastAsia="ko-KR"/>
+              </w:rPr>
+              <w:t xml:space="preserve"> </w:t>
+            </w:r>
+            <w:r>
+              <w:rPr>
+                <w:sz w:val="17"/>
+                <w:lang w:eastAsia="ko-KR"/>
+              </w:rPr>
+              <w:t>/</w:t>
+            </w:r>
+            <w:r>
+              <w:rPr>
+                <w:sz w:val="17"/>
+                <w:lang w:eastAsia="ko-KR"/>
+              </w:rPr>
+              <w:t xml:space="preserve"> </w:t>
+            </w:r>
+            <w:r>
+              <w:rPr>
+                <w:sz w:val="17"/>
+                <w:lang w:eastAsia="ko-KR"/>
+              </w:rPr>
+              <w:t>(100+방어))</w:t>
             </w:r>
           </w:p>
         </w:tc>
@@ -3421,14 +2981,12 @@
               </w:rPr>
               <w:t xml:space="preserve">무기 </w:t>
             </w:r>
-            <w:proofErr w:type="spellStart"/>
             <w:r>
               <w:rPr>
                 <w:sz w:val="17"/>
               </w:rPr>
               <w:t>강화</w:t>
             </w:r>
-            <w:proofErr w:type="spellEnd"/>
           </w:p>
         </w:tc>
         <w:tc>
@@ -3463,23 +3021,7 @@
                 <w:sz w:val="17"/>
                 <w:lang w:eastAsia="ko-KR"/>
               </w:rPr>
-              <w:t>레벨 * (</w:t>
-            </w:r>
-            <w:proofErr w:type="spellStart"/>
-            <w:r>
-              <w:rPr>
-                <w:sz w:val="17"/>
-                <w:lang w:eastAsia="ko-KR"/>
-              </w:rPr>
-              <w:t>강화석</w:t>
-            </w:r>
-            <w:proofErr w:type="spellEnd"/>
-            <w:r>
-              <w:rPr>
-                <w:sz w:val="17"/>
-                <w:lang w:eastAsia="ko-KR"/>
-              </w:rPr>
-              <w:t xml:space="preserve"> 2 + 링크 코어 5)</w:t>
+              <w:t>레벨 * (강화석 2 + 링크 코어 5)</w:t>
             </w:r>
           </w:p>
         </w:tc>
@@ -3528,23 +3070,7 @@
                 <w:sz w:val="17"/>
                 <w:lang w:eastAsia="ko-KR"/>
               </w:rPr>
-              <w:t xml:space="preserve"> =</w:t>
-            </w:r>
-            <w:proofErr w:type="spellStart"/>
-            <w:r>
-              <w:rPr>
-                <w:sz w:val="17"/>
-                <w:lang w:eastAsia="ko-KR"/>
-              </w:rPr>
-              <w:t>강화석</w:t>
-            </w:r>
-            <w:proofErr w:type="spellEnd"/>
-            <w:r>
-              <w:rPr>
-                <w:sz w:val="17"/>
-                <w:lang w:eastAsia="ko-KR"/>
-              </w:rPr>
-              <w:t xml:space="preserve"> 2 + 링크 코어 5</w:t>
+              <w:t xml:space="preserve"> =강화석 2 + 링크 코어 5</w:t>
             </w:r>
             <w:r>
               <w:rPr>
@@ -3691,23 +3217,7 @@
           <w:sz w:val="20"/>
           <w:lang w:eastAsia="ko-KR"/>
         </w:rPr>
-        <w:t xml:space="preserve">3 -&gt; 4) = </w:t>
-      </w:r>
-      <w:proofErr w:type="spellStart"/>
-      <w:r>
-        <w:rPr>
-          <w:sz w:val="20"/>
-          <w:lang w:eastAsia="ko-KR"/>
-        </w:rPr>
-        <w:t>강화석</w:t>
-      </w:r>
-      <w:proofErr w:type="spellEnd"/>
-      <w:r>
-        <w:rPr>
-          <w:sz w:val="20"/>
-          <w:lang w:eastAsia="ko-KR"/>
-        </w:rPr>
-        <w:t xml:space="preserve"> 6개 + 링크 코어 15개</w:t>
+        <w:t>3 -&gt; 4) = 강화석 6개 + 링크 코어 15개</w:t>
       </w:r>
     </w:p>
     <w:p>
@@ -3718,42 +3228,12 @@
           <w:numId w:val="1"/>
         </w:numPr>
       </w:pPr>
-      <w:proofErr w:type="spellStart"/>
       <w:r>
         <w:rPr>
           <w:rFonts w:ascii="맑은 고딕" w:eastAsia="맑은 고딕" w:hAnsi="맑은 고딕"/>
         </w:rPr>
-        <w:t>사용</w:t>
+        <w:t>사용 데이터 테이블</w:t>
       </w:r>
-      <w:proofErr w:type="spellEnd"/>
-      <w:r>
-        <w:rPr>
-          <w:rFonts w:ascii="맑은 고딕" w:eastAsia="맑은 고딕" w:hAnsi="맑은 고딕"/>
-        </w:rPr>
-        <w:t xml:space="preserve"> </w:t>
-      </w:r>
-      <w:proofErr w:type="spellStart"/>
-      <w:r>
-        <w:rPr>
-          <w:rFonts w:ascii="맑은 고딕" w:eastAsia="맑은 고딕" w:hAnsi="맑은 고딕"/>
-        </w:rPr>
-        <w:t>데이터</w:t>
-      </w:r>
-      <w:proofErr w:type="spellEnd"/>
-      <w:r>
-        <w:rPr>
-          <w:rFonts w:ascii="맑은 고딕" w:eastAsia="맑은 고딕" w:hAnsi="맑은 고딕"/>
-        </w:rPr>
-        <w:t xml:space="preserve"> </w:t>
-      </w:r>
-      <w:proofErr w:type="spellStart"/>
-      <w:r>
-        <w:rPr>
-          <w:rFonts w:ascii="맑은 고딕" w:eastAsia="맑은 고딕" w:hAnsi="맑은 고딕"/>
-        </w:rPr>
-        <w:t>테이블</w:t>
-      </w:r>
-      <w:proofErr w:type="spellEnd"/>
     </w:p>
     <w:p>
       <w:pPr>
@@ -3774,32 +3254,14 @@
           <w:sz w:val="18"/>
           <w:lang w:eastAsia="ko-KR"/>
         </w:rPr>
-        <w:t xml:space="preserve">데이터 </w:t>
-      </w:r>
-      <w:proofErr w:type="gramStart"/>
-      <w:r>
-        <w:rPr>
-          <w:b/>
-          <w:color w:val="1E5F8C"/>
-          <w:sz w:val="18"/>
-          <w:lang w:eastAsia="ko-KR"/>
-        </w:rPr>
-        <w:t xml:space="preserve">구성  </w:t>
+        <w:t xml:space="preserve">데이터 구성  </w:t>
       </w:r>
       <w:r>
         <w:rPr>
           <w:sz w:val="18"/>
           <w:lang w:eastAsia="ko-KR"/>
         </w:rPr>
-        <w:t>무기</w:t>
-      </w:r>
-      <w:proofErr w:type="gramEnd"/>
-      <w:r>
-        <w:rPr>
-          <w:sz w:val="18"/>
-          <w:lang w:eastAsia="ko-KR"/>
-        </w:rPr>
-        <w:t xml:space="preserve"> 아이템 테이블 / 자원 아이템 테이블</w:t>
+        <w:t>무기 아이템 테이블 / 자원 아이템 테이블</w:t>
       </w:r>
     </w:p>
     <w:p>
@@ -3820,7 +3282,6 @@
         </w:rPr>
         <w:t xml:space="preserve">무기 데이터: </w:t>
       </w:r>
-      <w:proofErr w:type="gramStart"/>
       <w:r>
         <w:rPr>
           <w:sz w:val="20"/>
@@ -3833,15 +3294,7 @@
           <w:sz w:val="20"/>
           <w:lang w:eastAsia="ko-KR"/>
         </w:rPr>
-        <w:t xml:space="preserve"> /</w:t>
-      </w:r>
-      <w:proofErr w:type="gramEnd"/>
-      <w:r>
-        <w:rPr>
-          <w:sz w:val="20"/>
-          <w:lang w:eastAsia="ko-KR"/>
-        </w:rPr>
-        <w:t xml:space="preserve"> </w:t>
+        <w:t xml:space="preserve"> / </w:t>
       </w:r>
       <w:r>
         <w:rPr>
@@ -3989,23 +3442,15 @@
           <w:sz w:val="20"/>
           <w:lang w:eastAsia="ko-KR"/>
         </w:rPr>
+        <w:lastRenderedPageBreak/>
         <w:t xml:space="preserve">자원 데이터: </w:t>
       </w:r>
-      <w:proofErr w:type="gramStart"/>
       <w:r>
         <w:rPr>
           <w:sz w:val="20"/>
           <w:lang w:eastAsia="ko-KR"/>
         </w:rPr>
-        <w:t>ID /</w:t>
-      </w:r>
-      <w:proofErr w:type="gramEnd"/>
-      <w:r>
-        <w:rPr>
-          <w:sz w:val="20"/>
-          <w:lang w:eastAsia="ko-KR"/>
-        </w:rPr>
-        <w:t xml:space="preserve"> </w:t>
+        <w:t xml:space="preserve">ID / </w:t>
       </w:r>
       <w:r>
         <w:rPr>
@@ -4101,7 +3546,6 @@
         </w:rPr>
         <w:t xml:space="preserve"> </w:t>
       </w:r>
-      <w:proofErr w:type="spellStart"/>
       <w:r>
         <w:rPr>
           <w:sz w:val="20"/>
@@ -4109,7 +3553,6 @@
         </w:rPr>
         <w:t>회복량</w:t>
       </w:r>
-      <w:proofErr w:type="spellEnd"/>
       <w:r>
         <w:rPr>
           <w:sz w:val="20"/>
@@ -4122,17 +3565,8 @@
           <w:sz w:val="20"/>
           <w:lang w:eastAsia="ko-KR"/>
         </w:rPr>
-        <w:t xml:space="preserve">슬롯 </w:t>
+        <w:t>슬롯 확장량</w:t>
       </w:r>
-      <w:proofErr w:type="spellStart"/>
-      <w:r>
-        <w:rPr>
-          <w:sz w:val="20"/>
-          <w:lang w:eastAsia="ko-KR"/>
-        </w:rPr>
-        <w:t>확장량</w:t>
-      </w:r>
-      <w:proofErr w:type="spellEnd"/>
       <w:r>
         <w:rPr>
           <w:sz w:val="20"/>
@@ -4162,7 +3596,6 @@
           <w:sz w:val="20"/>
           <w:lang w:eastAsia="ko-KR"/>
         </w:rPr>
-        <w:lastRenderedPageBreak/>
         <w:t xml:space="preserve">관리 목적: </w:t>
       </w:r>
       <w:r>
@@ -4267,7 +3700,6 @@
                 <w:sz w:val="16"/>
               </w:rPr>
             </w:pPr>
-            <w:proofErr w:type="spellStart"/>
             <w:r>
               <w:rPr>
                 <w:b/>
@@ -4275,7 +3707,6 @@
               </w:rPr>
               <w:t>명칭</w:t>
             </w:r>
-            <w:proofErr w:type="spellEnd"/>
           </w:p>
         </w:tc>
         <w:tc>
@@ -4325,7 +3756,6 @@
               <w:spacing w:after="0" w:line="252" w:lineRule="auto"/>
               <w:jc w:val="center"/>
             </w:pPr>
-            <w:proofErr w:type="spellStart"/>
             <w:r>
               <w:rPr>
                 <w:b/>
@@ -4333,7 +3763,6 @@
               </w:rPr>
               <w:t>크기</w:t>
             </w:r>
-            <w:proofErr w:type="spellEnd"/>
           </w:p>
         </w:tc>
         <w:tc>
@@ -4353,31 +3782,13 @@
               <w:spacing w:after="0" w:line="252" w:lineRule="auto"/>
               <w:jc w:val="center"/>
             </w:pPr>
-            <w:proofErr w:type="spellStart"/>
             <w:r>
               <w:rPr>
                 <w:b/>
                 <w:sz w:val="16"/>
               </w:rPr>
-              <w:t>최대</w:t>
-            </w:r>
-            <w:proofErr w:type="spellEnd"/>
-            <w:r>
-              <w:rPr>
-                <w:b/>
-                <w:sz w:val="16"/>
-              </w:rPr>
-              <w:t xml:space="preserve"> </w:t>
-            </w:r>
-            <w:proofErr w:type="spellStart"/>
-            <w:r>
-              <w:rPr>
-                <w:b/>
-                <w:sz w:val="16"/>
-              </w:rPr>
-              <w:t>레벨</w:t>
-            </w:r>
-            <w:proofErr w:type="spellEnd"/>
+              <w:t>최대 레벨</w:t>
+            </w:r>
           </w:p>
         </w:tc>
         <w:tc>
@@ -4397,7 +3808,6 @@
               <w:spacing w:after="0" w:line="252" w:lineRule="auto"/>
               <w:jc w:val="center"/>
             </w:pPr>
-            <w:proofErr w:type="spellStart"/>
             <w:r>
               <w:rPr>
                 <w:b/>
@@ -4405,7 +3815,6 @@
               </w:rPr>
               <w:t>데미지</w:t>
             </w:r>
-            <w:proofErr w:type="spellEnd"/>
           </w:p>
         </w:tc>
         <w:tc>
@@ -4425,31 +3834,13 @@
               <w:spacing w:after="0" w:line="252" w:lineRule="auto"/>
               <w:jc w:val="center"/>
             </w:pPr>
-            <w:proofErr w:type="spellStart"/>
             <w:r>
               <w:rPr>
                 <w:b/>
                 <w:sz w:val="16"/>
               </w:rPr>
-              <w:t>공격</w:t>
-            </w:r>
-            <w:proofErr w:type="spellEnd"/>
-            <w:r>
-              <w:rPr>
-                <w:b/>
-                <w:sz w:val="16"/>
-              </w:rPr>
-              <w:t xml:space="preserve"> </w:t>
-            </w:r>
-            <w:proofErr w:type="spellStart"/>
-            <w:r>
-              <w:rPr>
-                <w:b/>
-                <w:sz w:val="16"/>
-              </w:rPr>
-              <w:t>딜레이</w:t>
-            </w:r>
-            <w:proofErr w:type="spellEnd"/>
+              <w:t>공격 딜레이</w:t>
+            </w:r>
           </w:p>
         </w:tc>
         <w:tc>
@@ -4469,7 +3860,6 @@
               <w:spacing w:after="0" w:line="252" w:lineRule="auto"/>
               <w:jc w:val="center"/>
             </w:pPr>
-            <w:proofErr w:type="spellStart"/>
             <w:r>
               <w:rPr>
                 <w:b/>
@@ -4477,7 +3867,6 @@
               </w:rPr>
               <w:t>종류</w:t>
             </w:r>
-            <w:proofErr w:type="spellEnd"/>
           </w:p>
         </w:tc>
       </w:tr>
@@ -4521,42 +3910,12 @@
                 <w:sz w:val="16"/>
               </w:rPr>
             </w:pPr>
-            <w:proofErr w:type="spellStart"/>
             <w:r>
               <w:rPr>
                 <w:sz w:val="16"/>
               </w:rPr>
-              <w:t>경형</w:t>
-            </w:r>
-            <w:proofErr w:type="spellEnd"/>
-            <w:r>
-              <w:rPr>
-                <w:sz w:val="16"/>
-              </w:rPr>
-              <w:t xml:space="preserve"> </w:t>
-            </w:r>
-            <w:proofErr w:type="spellStart"/>
-            <w:r>
-              <w:rPr>
-                <w:sz w:val="16"/>
-              </w:rPr>
-              <w:t>녹슨</w:t>
-            </w:r>
-            <w:proofErr w:type="spellEnd"/>
-            <w:r>
-              <w:rPr>
-                <w:sz w:val="16"/>
-              </w:rPr>
-              <w:t xml:space="preserve"> </w:t>
-            </w:r>
-            <w:proofErr w:type="spellStart"/>
-            <w:r>
-              <w:rPr>
-                <w:sz w:val="16"/>
-              </w:rPr>
-              <w:t>철검</w:t>
-            </w:r>
-            <w:proofErr w:type="spellEnd"/>
+              <w:t>경형 녹슨 철검</w:t>
+            </w:r>
           </w:p>
         </w:tc>
         <w:tc>
@@ -4745,28 +4104,12 @@
                 <w:sz w:val="16"/>
               </w:rPr>
             </w:pPr>
-            <w:proofErr w:type="spellStart"/>
             <w:r>
               <w:rPr>
                 <w:sz w:val="16"/>
               </w:rPr>
-              <w:t>표준형</w:t>
-            </w:r>
-            <w:proofErr w:type="spellEnd"/>
-            <w:r>
-              <w:rPr>
-                <w:sz w:val="16"/>
-              </w:rPr>
-              <w:t xml:space="preserve"> </w:t>
-            </w:r>
-            <w:proofErr w:type="spellStart"/>
-            <w:r>
-              <w:rPr>
-                <w:sz w:val="16"/>
-              </w:rPr>
-              <w:t>합금검</w:t>
-            </w:r>
-            <w:proofErr w:type="spellEnd"/>
+              <w:t>표준형 합금검</w:t>
+            </w:r>
           </w:p>
         </w:tc>
         <w:tc>
@@ -4959,28 +4302,12 @@
                 <w:sz w:val="16"/>
               </w:rPr>
             </w:pPr>
-            <w:proofErr w:type="spellStart"/>
             <w:r>
               <w:rPr>
                 <w:sz w:val="16"/>
               </w:rPr>
-              <w:t>중량형</w:t>
-            </w:r>
-            <w:proofErr w:type="spellEnd"/>
-            <w:r>
-              <w:rPr>
-                <w:sz w:val="16"/>
-              </w:rPr>
-              <w:t xml:space="preserve"> </w:t>
-            </w:r>
-            <w:proofErr w:type="spellStart"/>
-            <w:r>
-              <w:rPr>
-                <w:sz w:val="16"/>
-              </w:rPr>
-              <w:t>합금검</w:t>
-            </w:r>
-            <w:proofErr w:type="spellEnd"/>
+              <w:t>중량형 합금검</w:t>
+            </w:r>
           </w:p>
         </w:tc>
         <w:tc>
@@ -5169,28 +4496,12 @@
                 <w:sz w:val="16"/>
               </w:rPr>
             </w:pPr>
-            <w:proofErr w:type="spellStart"/>
             <w:r>
               <w:rPr>
                 <w:sz w:val="16"/>
               </w:rPr>
-              <w:t>플리즈마</w:t>
-            </w:r>
-            <w:proofErr w:type="spellEnd"/>
-            <w:r>
-              <w:rPr>
-                <w:sz w:val="16"/>
-              </w:rPr>
-              <w:t xml:space="preserve"> </w:t>
-            </w:r>
-            <w:proofErr w:type="spellStart"/>
-            <w:r>
-              <w:rPr>
-                <w:sz w:val="16"/>
-              </w:rPr>
-              <w:t>엣지</w:t>
-            </w:r>
-            <w:proofErr w:type="spellEnd"/>
+              <w:t>플리즈마 엣지</w:t>
+            </w:r>
           </w:p>
         </w:tc>
         <w:tc>
@@ -5453,7 +4764,6 @@
                 <w:sz w:val="16"/>
               </w:rPr>
             </w:pPr>
-            <w:proofErr w:type="spellStart"/>
             <w:r>
               <w:rPr>
                 <w:b/>
@@ -5461,7 +4771,6 @@
               </w:rPr>
               <w:t>명칭</w:t>
             </w:r>
-            <w:proofErr w:type="spellEnd"/>
           </w:p>
         </w:tc>
         <w:tc>
@@ -5506,7 +4815,6 @@
                 <w:sz w:val="16"/>
               </w:rPr>
             </w:pPr>
-            <w:proofErr w:type="spellStart"/>
             <w:r>
               <w:rPr>
                 <w:b/>
@@ -5514,7 +4822,6 @@
               </w:rPr>
               <w:t>크기</w:t>
             </w:r>
-            <w:proofErr w:type="spellEnd"/>
           </w:p>
         </w:tc>
         <w:tc>
@@ -5534,7 +4841,6 @@
               <w:spacing w:after="0" w:line="252" w:lineRule="auto"/>
               <w:jc w:val="center"/>
             </w:pPr>
-            <w:proofErr w:type="spellStart"/>
             <w:r>
               <w:rPr>
                 <w:b/>
@@ -5542,7 +4848,6 @@
               </w:rPr>
               <w:t>수량</w:t>
             </w:r>
-            <w:proofErr w:type="spellEnd"/>
           </w:p>
         </w:tc>
         <w:tc>
@@ -5562,7 +4867,6 @@
               <w:spacing w:after="0" w:line="252" w:lineRule="auto"/>
               <w:jc w:val="center"/>
             </w:pPr>
-            <w:proofErr w:type="spellStart"/>
             <w:r>
               <w:rPr>
                 <w:b/>
@@ -5570,7 +4874,6 @@
               </w:rPr>
               <w:t>속성</w:t>
             </w:r>
-            <w:proofErr w:type="spellEnd"/>
           </w:p>
         </w:tc>
         <w:tc>
@@ -5588,7 +4891,6 @@
                 <w:sz w:val="16"/>
               </w:rPr>
             </w:pPr>
-            <w:proofErr w:type="spellStart"/>
             <w:r>
               <w:rPr>
                 <w:b/>
@@ -5596,7 +4898,6 @@
               </w:rPr>
               <w:t>데미지</w:t>
             </w:r>
-            <w:proofErr w:type="spellEnd"/>
           </w:p>
         </w:tc>
         <w:tc>
@@ -5616,7 +4917,6 @@
               <w:spacing w:after="0" w:line="252" w:lineRule="auto"/>
               <w:jc w:val="center"/>
             </w:pPr>
-            <w:proofErr w:type="spellStart"/>
             <w:r>
               <w:rPr>
                 <w:b/>
@@ -5624,7 +4924,6 @@
               </w:rPr>
               <w:t>회복량</w:t>
             </w:r>
-            <w:proofErr w:type="spellEnd"/>
           </w:p>
         </w:tc>
         <w:tc>
@@ -5644,31 +4943,13 @@
               <w:spacing w:after="0" w:line="252" w:lineRule="auto"/>
               <w:jc w:val="center"/>
             </w:pPr>
-            <w:proofErr w:type="spellStart"/>
             <w:r>
               <w:rPr>
                 <w:b/>
                 <w:sz w:val="16"/>
               </w:rPr>
-              <w:t>슬롯</w:t>
-            </w:r>
-            <w:proofErr w:type="spellEnd"/>
-            <w:r>
-              <w:rPr>
-                <w:b/>
-                <w:sz w:val="16"/>
-              </w:rPr>
-              <w:t xml:space="preserve"> </w:t>
-            </w:r>
-            <w:proofErr w:type="spellStart"/>
-            <w:r>
-              <w:rPr>
-                <w:b/>
-                <w:sz w:val="16"/>
-              </w:rPr>
-              <w:t>확장</w:t>
-            </w:r>
-            <w:proofErr w:type="spellEnd"/>
+              <w:t>슬롯 확장</w:t>
+            </w:r>
           </w:p>
         </w:tc>
         <w:tc>
@@ -5688,7 +4969,6 @@
               <w:spacing w:after="0" w:line="252" w:lineRule="auto"/>
               <w:jc w:val="center"/>
             </w:pPr>
-            <w:proofErr w:type="spellStart"/>
             <w:r>
               <w:rPr>
                 <w:b/>
@@ -5696,7 +4976,6 @@
               </w:rPr>
               <w:t>종류</w:t>
             </w:r>
-            <w:proofErr w:type="spellEnd"/>
           </w:p>
         </w:tc>
       </w:tr>
@@ -5740,14 +5019,12 @@
                 <w:sz w:val="16"/>
               </w:rPr>
             </w:pPr>
-            <w:proofErr w:type="spellStart"/>
             <w:r>
               <w:rPr>
                 <w:sz w:val="16"/>
               </w:rPr>
               <w:t>생명수</w:t>
             </w:r>
-            <w:proofErr w:type="spellEnd"/>
           </w:p>
         </w:tc>
         <w:tc>
@@ -5978,42 +5255,12 @@
                 <w:sz w:val="16"/>
               </w:rPr>
             </w:pPr>
-            <w:proofErr w:type="spellStart"/>
             <w:r>
               <w:rPr>
                 <w:sz w:val="16"/>
               </w:rPr>
-              <w:t>무기</w:t>
-            </w:r>
-            <w:proofErr w:type="spellEnd"/>
-            <w:r>
-              <w:rPr>
-                <w:sz w:val="16"/>
-              </w:rPr>
-              <w:t xml:space="preserve"> </w:t>
-            </w:r>
-            <w:proofErr w:type="spellStart"/>
-            <w:r>
-              <w:rPr>
-                <w:sz w:val="16"/>
-              </w:rPr>
-              <w:t>슬롯</w:t>
-            </w:r>
-            <w:proofErr w:type="spellEnd"/>
-            <w:r>
-              <w:rPr>
-                <w:sz w:val="16"/>
-              </w:rPr>
-              <w:t xml:space="preserve"> </w:t>
-            </w:r>
-            <w:proofErr w:type="spellStart"/>
-            <w:r>
-              <w:rPr>
-                <w:sz w:val="16"/>
-              </w:rPr>
-              <w:t>확장팩</w:t>
-            </w:r>
-            <w:proofErr w:type="spellEnd"/>
+              <w:t>무기 슬롯 확장팩</w:t>
+            </w:r>
           </w:p>
         </w:tc>
         <w:tc>
@@ -6201,14 +5448,12 @@
               <w:spacing w:after="0" w:line="252" w:lineRule="auto"/>
               <w:jc w:val="center"/>
             </w:pPr>
-            <w:proofErr w:type="spellStart"/>
             <w:r>
               <w:rPr>
                 <w:sz w:val="16"/>
               </w:rPr>
               <w:t>SlotExpansion</w:t>
             </w:r>
-            <w:proofErr w:type="spellEnd"/>
           </w:p>
         </w:tc>
       </w:tr>
@@ -6252,42 +5497,12 @@
                 <w:sz w:val="16"/>
               </w:rPr>
             </w:pPr>
-            <w:proofErr w:type="spellStart"/>
             <w:r>
               <w:rPr>
                 <w:sz w:val="16"/>
               </w:rPr>
-              <w:t>화염</w:t>
-            </w:r>
-            <w:proofErr w:type="spellEnd"/>
-            <w:r>
-              <w:rPr>
-                <w:sz w:val="16"/>
-              </w:rPr>
-              <w:t xml:space="preserve"> </w:t>
-            </w:r>
-            <w:proofErr w:type="spellStart"/>
-            <w:r>
-              <w:rPr>
-                <w:sz w:val="16"/>
-              </w:rPr>
-              <w:t>속성</w:t>
-            </w:r>
-            <w:proofErr w:type="spellEnd"/>
-            <w:r>
-              <w:rPr>
-                <w:sz w:val="16"/>
-              </w:rPr>
-              <w:t xml:space="preserve"> </w:t>
-            </w:r>
-            <w:proofErr w:type="spellStart"/>
-            <w:r>
-              <w:rPr>
-                <w:sz w:val="16"/>
-              </w:rPr>
-              <w:t>결정체</w:t>
-            </w:r>
-            <w:proofErr w:type="spellEnd"/>
+              <w:t>화염 속성 결정체</w:t>
+            </w:r>
           </w:p>
         </w:tc>
         <w:tc>
@@ -6518,28 +5733,12 @@
                 <w:sz w:val="16"/>
               </w:rPr>
             </w:pPr>
-            <w:proofErr w:type="spellStart"/>
             <w:r>
               <w:rPr>
                 <w:sz w:val="16"/>
               </w:rPr>
-              <w:t>링크</w:t>
-            </w:r>
-            <w:proofErr w:type="spellEnd"/>
-            <w:r>
-              <w:rPr>
-                <w:sz w:val="16"/>
-              </w:rPr>
-              <w:t xml:space="preserve"> </w:t>
-            </w:r>
-            <w:proofErr w:type="spellStart"/>
-            <w:r>
-              <w:rPr>
-                <w:sz w:val="16"/>
-              </w:rPr>
-              <w:t>코어</w:t>
-            </w:r>
-            <w:proofErr w:type="spellEnd"/>
+              <w:t>링크 코어</w:t>
+            </w:r>
           </w:p>
         </w:tc>
         <w:tc>
@@ -6791,32 +5990,14 @@
           <w:sz w:val="18"/>
           <w:lang w:eastAsia="ko-KR"/>
         </w:rPr>
-        <w:t xml:space="preserve">테스트 </w:t>
-      </w:r>
-      <w:proofErr w:type="gramStart"/>
-      <w:r>
-        <w:rPr>
-          <w:b/>
-          <w:color w:val="1E5F8C"/>
-          <w:sz w:val="18"/>
-          <w:lang w:eastAsia="ko-KR"/>
-        </w:rPr>
-        <w:t xml:space="preserve">구분  </w:t>
+        <w:t xml:space="preserve">테스트 구분  </w:t>
       </w:r>
       <w:r>
         <w:rPr>
           <w:sz w:val="18"/>
           <w:lang w:eastAsia="ko-KR"/>
         </w:rPr>
-        <w:t>정상</w:t>
-      </w:r>
-      <w:proofErr w:type="gramEnd"/>
-      <w:r>
-        <w:rPr>
-          <w:sz w:val="18"/>
-          <w:lang w:eastAsia="ko-KR"/>
-        </w:rPr>
-        <w:t xml:space="preserve"> 상황 / 실패 상황 / 예외 상황</w:t>
+        <w:t>정상 상황 / 실패 상황 / 예외 상황</w:t>
       </w:r>
     </w:p>
     <w:p>
@@ -6868,23 +6049,7 @@
           <w:sz w:val="20"/>
           <w:lang w:eastAsia="ko-KR"/>
         </w:rPr>
-        <w:t xml:space="preserve">속성 중첩, </w:t>
-      </w:r>
-      <w:proofErr w:type="spellStart"/>
-      <w:r>
-        <w:rPr>
-          <w:sz w:val="20"/>
-          <w:lang w:eastAsia="ko-KR"/>
-        </w:rPr>
-        <w:t>비조준</w:t>
-      </w:r>
-      <w:proofErr w:type="spellEnd"/>
-      <w:r>
-        <w:rPr>
-          <w:sz w:val="20"/>
-          <w:lang w:eastAsia="ko-KR"/>
-        </w:rPr>
-        <w:t xml:space="preserve"> 발사, 공유 아이템 중복 사용 여부 확인</w:t>
+        <w:t>속성 중첩, 비조준 발사, 공유 아이템 중복 사용 여부 확인</w:t>
       </w:r>
     </w:p>
     <w:p>
@@ -7137,14 +6302,12 @@
               <w:spacing w:after="0" w:line="252" w:lineRule="auto"/>
               <w:jc w:val="center"/>
             </w:pPr>
-            <w:proofErr w:type="spellStart"/>
             <w:r>
               <w:rPr>
                 <w:sz w:val="18"/>
               </w:rPr>
               <w:t>실패</w:t>
             </w:r>
-            <w:proofErr w:type="spellEnd"/>
           </w:p>
         </w:tc>
         <w:tc>
@@ -7171,23 +6334,7 @@
                 <w:sz w:val="18"/>
                 <w:lang w:eastAsia="ko-KR"/>
               </w:rPr>
-              <w:t xml:space="preserve">조준 없이 </w:t>
-            </w:r>
-            <w:proofErr w:type="gramStart"/>
-            <w:r>
-              <w:rPr>
-                <w:sz w:val="18"/>
-                <w:lang w:eastAsia="ko-KR"/>
-              </w:rPr>
-              <w:t>발사 /</w:t>
-            </w:r>
-            <w:proofErr w:type="gramEnd"/>
-            <w:r>
-              <w:rPr>
-                <w:sz w:val="18"/>
-                <w:lang w:eastAsia="ko-KR"/>
-              </w:rPr>
-              <w:t xml:space="preserve"> 공유 아이템 중복 사용</w:t>
+              <w:t>조준 없이 발사 / 공유 아이템 중복 사용</w:t>
             </w:r>
           </w:p>
         </w:tc>
@@ -7237,14 +6384,12 @@
               <w:spacing w:after="0" w:line="252" w:lineRule="auto"/>
               <w:jc w:val="center"/>
             </w:pPr>
-            <w:proofErr w:type="spellStart"/>
             <w:r>
               <w:rPr>
                 <w:sz w:val="18"/>
               </w:rPr>
               <w:t>예외</w:t>
             </w:r>
-            <w:proofErr w:type="spellEnd"/>
           </w:p>
         </w:tc>
         <w:tc>
@@ -7336,32 +6481,14 @@
           <w:sz w:val="18"/>
           <w:lang w:eastAsia="ko-KR"/>
         </w:rPr>
-        <w:t xml:space="preserve">핵심 </w:t>
-      </w:r>
-      <w:proofErr w:type="gramStart"/>
-      <w:r>
-        <w:rPr>
-          <w:b/>
-          <w:color w:val="1E5F8C"/>
-          <w:sz w:val="18"/>
-          <w:lang w:eastAsia="ko-KR"/>
-        </w:rPr>
-        <w:t xml:space="preserve">정리  </w:t>
+        <w:t xml:space="preserve">핵심 정리  </w:t>
       </w:r>
       <w:r>
         <w:rPr>
           <w:sz w:val="18"/>
           <w:lang w:eastAsia="ko-KR"/>
         </w:rPr>
-        <w:t>스토리</w:t>
-      </w:r>
-      <w:proofErr w:type="gramEnd"/>
-      <w:r>
-        <w:rPr>
-          <w:sz w:val="18"/>
-          <w:lang w:eastAsia="ko-KR"/>
-        </w:rPr>
-        <w:t xml:space="preserve"> 목표, 반복 전투, 성장 선택, 데이터 기반 밸런스, 예외 테스트를 하나의 전투·성장 루프로 연결</w:t>
+        <w:t>스토리 목표, 반복 전투, 성장 선택, 데이터 기반 밸런스, 예외 테스트를 하나의 전투·성장 루프로 연결</w:t>
       </w:r>
     </w:p>
     <w:sectPr>

</xml_diff>